<commit_message>
Hợp đồng: PDF lấy đúng nội dung từ mẫu docx; bỏ 2 phụ lục khỏi docx
- Xóa 2 phần Phụ lục (01, 02) khỏi templates/mau-hop-dong-kol-koc.docx (cắt từ
  "PHỤ LỤC 01" tới trước sectPr cuối; giữ đủ 16 Điều, docx vẫn render được).
- kol-pdf: buildKolContractPdf nay dựng PDF từ NGUYÊN VĂN mẫu docx
  (KOL_AGREEMENT_SECTIONS: căn cứ + Điều 1-16) thay vì bản tự viết; giữ header,
  bảng hai Bên điền sẵn và chữ ký Bên B IN ĐẬM. Tiêu đề khớp docx (THỎA THUẬN
  HỢP TÁC KOL/KOC).
- kol-agreement: buildDisplayParagraphs xử lý khi docx KHÔNG còn "PHỤ LỤC 01"
  (appendixStart=-1 → dùng all.length) nên vẫn strip đúng bảng hai Bên, không
  rò XML thô vào nội dung hiển thị/PDF.

Đã verify: PDF render 16 Điều tiếng Việt sạch + chữ ký Bên B in đậm (host + container).

Co-Authored-By: Claude Opus 4.8 <noreply@anthropic.com>
Claude-Session: https://claude.ai/code/session_014LyuvkLajABfj2GdgA5ZYx
</commit_message>
<xml_diff>
--- a/templates/mau-hop-dong-kol-koc.docx
+++ b/templates/mau-hop-dong-kol-koc.docx
@@ -2728,2128 +2728,6 @@
         <w:t>Thỏa thuận được lập bằng tiếng Việt, có thể tồn tại dưới bản giấy hoặc bản điện tử và có giá trị như nhau theo pháp luật.</w:t>
       </w:r>
     </w:p>
-    <w:p>
-      <w:pPr>
-        <w:pageBreakBefore/>
-        <w:jc w:val="center"/>
-      </w:pPr>
-      <w:r>
-        <w:rPr>
-          <w:rFonts w:ascii="Times New Roman" w:hAnsi="Times New Roman" w:eastAsia="Times New Roman"/>
-          <w:b/>
-          <w:color w:val="1A365D"/>
-          <w:sz w:val="30"/>
-        </w:rPr>
-        <w:t>PHỤ LỤC 01</w:t>
-      </w:r>
-    </w:p>
-    <w:p>
-      <w:pPr>
-        <w:jc w:val="center"/>
-      </w:pPr>
-      <w:r>
-        <w:rPr>
-          <w:rFonts w:ascii="Times New Roman" w:hAnsi="Times New Roman" w:eastAsia="Times New Roman"/>
-          <w:b/>
-          <w:sz w:val="26"/>
-        </w:rPr>
-        <w:t>HỒ SƠ ĐĂNG KÝ &amp; XÁC MINH KOL/KOC</w:t>
-      </w:r>
-    </w:p>
-    <w:p>
-      <w:pPr>
-        <w:spacing w:after="200"/>
-        <w:jc w:val="center"/>
-      </w:pPr>
-      <w:r>
-        <w:rPr>
-          <w:rFonts w:ascii="Times New Roman" w:hAnsi="Times New Roman" w:eastAsia="Times New Roman"/>
-          <w:i/>
-          <w:color w:val="646464"/>
-          <w:sz w:val="20"/>
-        </w:rPr>
-        <w:t>(Kèm theo Thỏa thuận hợp tác KOL/KOC số ……/2026/HT-KOLKOC)</w:t>
-      </w:r>
-    </w:p>
-    <w:tbl>
-      <w:tblPr>
-        <w:tblW w:type="auto" w:w="0"/>
-        <w:jc w:val="center"/>
-        <w:tblLayout w:type="fixed"/>
-        <w:tblLook w:firstColumn="1" w:firstRow="1" w:lastColumn="0" w:lastRow="0" w:noHBand="0" w:noVBand="1" w:val="04A0"/>
-      </w:tblPr>
-      <w:tblGrid>
-        <w:gridCol w:w="2493"/>
-        <w:gridCol w:w="2493"/>
-        <w:gridCol w:w="2493"/>
-        <w:gridCol w:w="2493"/>
-      </w:tblGrid>
-      <w:tr>
-        <w:trPr>
-          <w:cantSplit/>
-        </w:trPr>
-        <w:tc>
-          <w:tcPr>
-            <w:tcW w:type="dxa" w:w="2493"/>
-            <w:shd w:fill="D9E2F3"/>
-          </w:tcPr>
-          <w:p>
-            <w:pPr>
-              <w:jc w:val="center"/>
-            </w:pPr>
-            <w:r>
-              <w:rPr>
-                <w:rFonts w:ascii="Times New Roman" w:hAnsi="Times New Roman" w:eastAsia="Times New Roman"/>
-                <w:b/>
-                <w:sz w:val="21"/>
-              </w:rPr>
-              <w:t>STT</w:t>
-            </w:r>
-          </w:p>
-        </w:tc>
-        <w:tc>
-          <w:tcPr>
-            <w:tcW w:type="dxa" w:w="2493"/>
-            <w:shd w:fill="D9E2F3"/>
-          </w:tcPr>
-          <w:p>
-            <w:pPr>
-              <w:jc w:val="center"/>
-            </w:pPr>
-            <w:r>
-              <w:rPr>
-                <w:rFonts w:ascii="Times New Roman" w:hAnsi="Times New Roman" w:eastAsia="Times New Roman"/>
-                <w:b/>
-                <w:sz w:val="21"/>
-              </w:rPr>
-              <w:t>Hồ sơ/thông tin</w:t>
-            </w:r>
-          </w:p>
-        </w:tc>
-        <w:tc>
-          <w:tcPr>
-            <w:tcW w:type="dxa" w:w="2493"/>
-            <w:shd w:fill="D9E2F3"/>
-          </w:tcPr>
-          <w:p>
-            <w:pPr>
-              <w:jc w:val="center"/>
-            </w:pPr>
-            <w:r>
-              <w:rPr>
-                <w:rFonts w:ascii="Times New Roman" w:hAnsi="Times New Roman" w:eastAsia="Times New Roman"/>
-                <w:b/>
-                <w:sz w:val="21"/>
-              </w:rPr>
-              <w:t>Nội dung Bên B cung cấp</w:t>
-            </w:r>
-          </w:p>
-        </w:tc>
-        <w:tc>
-          <w:tcPr>
-            <w:tcW w:type="dxa" w:w="2493"/>
-            <w:shd w:fill="D9E2F3"/>
-          </w:tcPr>
-          <w:p>
-            <w:pPr>
-              <w:jc w:val="center"/>
-            </w:pPr>
-            <w:r>
-              <w:rPr>
-                <w:rFonts w:ascii="Times New Roman" w:hAnsi="Times New Roman" w:eastAsia="Times New Roman"/>
-                <w:b/>
-                <w:sz w:val="21"/>
-              </w:rPr>
-              <w:t>Kiểm tra</w:t>
-            </w:r>
-          </w:p>
-        </w:tc>
-      </w:tr>
-      <w:tr>
-        <w:trPr>
-          <w:cantSplit/>
-        </w:trPr>
-        <w:tc>
-          <w:tcPr>
-            <w:tcW w:type="dxa" w:w="2493"/>
-            <w:tcMar>
-              <w:top w:w="110" w:type="dxa"/>
-              <w:start w:w="110" w:type="dxa"/>
-              <w:bottom w:w="110" w:type="dxa"/>
-              <w:end w:w="110" w:type="dxa"/>
-            </w:tcMar>
-            <w:vAlign w:val="center"/>
-            <w:tcBorders>
-              <w:top w:val="single" w:sz="4" w:color="D9E2F3"/>
-              <w:left w:val="single" w:sz="4" w:color="D9E2F3"/>
-              <w:bottom w:val="single" w:sz="4" w:color="D9E2F3"/>
-              <w:right w:val="single" w:sz="4" w:color="D9E2F3"/>
-            </w:tcBorders>
-          </w:tcPr>
-          <w:p>
-            <w:pPr>
-              <w:jc w:val="center"/>
-            </w:pPr>
-            <w:r>
-              <w:rPr>
-                <w:rFonts w:ascii="Times New Roman" w:hAnsi="Times New Roman" w:eastAsia="Times New Roman"/>
-                <w:sz w:val="20"/>
-              </w:rPr>
-              <w:t>1</w:t>
-            </w:r>
-          </w:p>
-        </w:tc>
-        <w:tc>
-          <w:tcPr>
-            <w:tcW w:type="dxa" w:w="2493"/>
-            <w:tcMar>
-              <w:top w:w="110" w:type="dxa"/>
-              <w:start w:w="110" w:type="dxa"/>
-              <w:bottom w:w="110" w:type="dxa"/>
-              <w:end w:w="110" w:type="dxa"/>
-            </w:tcMar>
-            <w:vAlign w:val="center"/>
-            <w:tcBorders>
-              <w:top w:val="single" w:sz="4" w:color="D9E2F3"/>
-              <w:left w:val="single" w:sz="4" w:color="D9E2F3"/>
-              <w:bottom w:val="single" w:sz="4" w:color="D9E2F3"/>
-              <w:right w:val="single" w:sz="4" w:color="D9E2F3"/>
-            </w:tcBorders>
-          </w:tcPr>
-          <w:p>
-            <w:r>
-              <w:rPr>
-                <w:rFonts w:ascii="Times New Roman" w:hAnsi="Times New Roman" w:eastAsia="Times New Roman"/>
-                <w:sz w:val="20"/>
-              </w:rPr>
-              <w:t>TikTok</w:t>
-            </w:r>
-          </w:p>
-        </w:tc>
-        <w:tc>
-          <w:tcPr>
-            <w:tcW w:type="dxa" w:w="2493"/>
-            <w:tcMar>
-              <w:top w:w="110" w:type="dxa"/>
-              <w:start w:w="110" w:type="dxa"/>
-              <w:bottom w:w="110" w:type="dxa"/>
-              <w:end w:w="110" w:type="dxa"/>
-            </w:tcMar>
-            <w:vAlign w:val="center"/>
-            <w:tcBorders>
-              <w:top w:val="single" w:sz="4" w:color="D9E2F3"/>
-              <w:left w:val="single" w:sz="4" w:color="D9E2F3"/>
-              <w:bottom w:val="single" w:sz="4" w:color="D9E2F3"/>
-              <w:right w:val="single" w:sz="4" w:color="D9E2F3"/>
-            </w:tcBorders>
-          </w:tcPr>
-          <w:p>
-            <w:r>
-              <w:rPr>
-                <w:rFonts w:ascii="Times New Roman" w:hAnsi="Times New Roman" w:eastAsia="Times New Roman"/>
-                <w:sz w:val="20"/>
-              </w:rPr>
-              <w:t>URL: ______________________________</w:t>
-              <w:br/>
-              <w:t>Tên tài khoản: _____________________</w:t>
-            </w:r>
-          </w:p>
-        </w:tc>
-        <w:tc>
-          <w:tcPr>
-            <w:tcW w:type="dxa" w:w="2493"/>
-            <w:tcMar>
-              <w:top w:w="110" w:type="dxa"/>
-              <w:start w:w="110" w:type="dxa"/>
-              <w:bottom w:w="110" w:type="dxa"/>
-              <w:end w:w="110" w:type="dxa"/>
-            </w:tcMar>
-            <w:vAlign w:val="center"/>
-            <w:tcBorders>
-              <w:top w:val="single" w:sz="4" w:color="D9E2F3"/>
-              <w:left w:val="single" w:sz="4" w:color="D9E2F3"/>
-              <w:bottom w:val="single" w:sz="4" w:color="D9E2F3"/>
-              <w:right w:val="single" w:sz="4" w:color="D9E2F3"/>
-            </w:tcBorders>
-          </w:tcPr>
-          <w:p>
-            <w:pPr>
-              <w:jc w:val="center"/>
-            </w:pPr>
-            <w:r>
-              <w:rPr>
-                <w:rFonts w:ascii="Times New Roman" w:hAnsi="Times New Roman" w:eastAsia="Times New Roman"/>
-                <w:sz w:val="20"/>
-              </w:rPr>
-              <w:t>☐</w:t>
-            </w:r>
-          </w:p>
-        </w:tc>
-      </w:tr>
-      <w:tr>
-        <w:trPr>
-          <w:cantSplit/>
-        </w:trPr>
-        <w:tc>
-          <w:tcPr>
-            <w:tcW w:type="dxa" w:w="2493"/>
-            <w:tcMar>
-              <w:top w:w="110" w:type="dxa"/>
-              <w:start w:w="110" w:type="dxa"/>
-              <w:bottom w:w="110" w:type="dxa"/>
-              <w:end w:w="110" w:type="dxa"/>
-            </w:tcMar>
-            <w:vAlign w:val="center"/>
-            <w:tcBorders>
-              <w:top w:val="single" w:sz="4" w:color="D9E2F3"/>
-              <w:left w:val="single" w:sz="4" w:color="D9E2F3"/>
-              <w:bottom w:val="single" w:sz="4" w:color="D9E2F3"/>
-              <w:right w:val="single" w:sz="4" w:color="D9E2F3"/>
-            </w:tcBorders>
-          </w:tcPr>
-          <w:p>
-            <w:pPr>
-              <w:jc w:val="center"/>
-            </w:pPr>
-            <w:r>
-              <w:rPr>
-                <w:rFonts w:ascii="Times New Roman" w:hAnsi="Times New Roman" w:eastAsia="Times New Roman"/>
-                <w:sz w:val="20"/>
-              </w:rPr>
-              <w:t>2</w:t>
-            </w:r>
-          </w:p>
-        </w:tc>
-        <w:tc>
-          <w:tcPr>
-            <w:tcW w:type="dxa" w:w="2493"/>
-            <w:tcMar>
-              <w:top w:w="110" w:type="dxa"/>
-              <w:start w:w="110" w:type="dxa"/>
-              <w:bottom w:w="110" w:type="dxa"/>
-              <w:end w:w="110" w:type="dxa"/>
-            </w:tcMar>
-            <w:vAlign w:val="center"/>
-            <w:tcBorders>
-              <w:top w:val="single" w:sz="4" w:color="D9E2F3"/>
-              <w:left w:val="single" w:sz="4" w:color="D9E2F3"/>
-              <w:bottom w:val="single" w:sz="4" w:color="D9E2F3"/>
-              <w:right w:val="single" w:sz="4" w:color="D9E2F3"/>
-            </w:tcBorders>
-          </w:tcPr>
-          <w:p>
-            <w:r>
-              <w:rPr>
-                <w:rFonts w:ascii="Times New Roman" w:hAnsi="Times New Roman" w:eastAsia="Times New Roman"/>
-                <w:sz w:val="20"/>
-              </w:rPr>
-              <w:t>Facebook</w:t>
-            </w:r>
-          </w:p>
-        </w:tc>
-        <w:tc>
-          <w:tcPr>
-            <w:tcW w:type="dxa" w:w="2493"/>
-            <w:tcMar>
-              <w:top w:w="110" w:type="dxa"/>
-              <w:start w:w="110" w:type="dxa"/>
-              <w:bottom w:w="110" w:type="dxa"/>
-              <w:end w:w="110" w:type="dxa"/>
-            </w:tcMar>
-            <w:vAlign w:val="center"/>
-            <w:tcBorders>
-              <w:top w:val="single" w:sz="4" w:color="D9E2F3"/>
-              <w:left w:val="single" w:sz="4" w:color="D9E2F3"/>
-              <w:bottom w:val="single" w:sz="4" w:color="D9E2F3"/>
-              <w:right w:val="single" w:sz="4" w:color="D9E2F3"/>
-            </w:tcBorders>
-          </w:tcPr>
-          <w:p>
-            <w:r>
-              <w:rPr>
-                <w:rFonts w:ascii="Times New Roman" w:hAnsi="Times New Roman" w:eastAsia="Times New Roman"/>
-                <w:sz w:val="20"/>
-              </w:rPr>
-              <w:t>URL: ______________________________</w:t>
-              <w:br/>
-              <w:t>Tên trang/profile: __________________</w:t>
-            </w:r>
-          </w:p>
-        </w:tc>
-        <w:tc>
-          <w:tcPr>
-            <w:tcW w:type="dxa" w:w="2493"/>
-            <w:tcMar>
-              <w:top w:w="110" w:type="dxa"/>
-              <w:start w:w="110" w:type="dxa"/>
-              <w:bottom w:w="110" w:type="dxa"/>
-              <w:end w:w="110" w:type="dxa"/>
-            </w:tcMar>
-            <w:vAlign w:val="center"/>
-            <w:tcBorders>
-              <w:top w:val="single" w:sz="4" w:color="D9E2F3"/>
-              <w:left w:val="single" w:sz="4" w:color="D9E2F3"/>
-              <w:bottom w:val="single" w:sz="4" w:color="D9E2F3"/>
-              <w:right w:val="single" w:sz="4" w:color="D9E2F3"/>
-            </w:tcBorders>
-          </w:tcPr>
-          <w:p>
-            <w:pPr>
-              <w:jc w:val="center"/>
-            </w:pPr>
-            <w:r>
-              <w:rPr>
-                <w:rFonts w:ascii="Times New Roman" w:hAnsi="Times New Roman" w:eastAsia="Times New Roman"/>
-                <w:sz w:val="20"/>
-              </w:rPr>
-              <w:t>☐</w:t>
-            </w:r>
-          </w:p>
-        </w:tc>
-      </w:tr>
-      <w:tr>
-        <w:trPr>
-          <w:cantSplit/>
-        </w:trPr>
-        <w:tc>
-          <w:tcPr>
-            <w:tcW w:type="dxa" w:w="2493"/>
-            <w:tcMar>
-              <w:top w:w="110" w:type="dxa"/>
-              <w:start w:w="110" w:type="dxa"/>
-              <w:bottom w:w="110" w:type="dxa"/>
-              <w:end w:w="110" w:type="dxa"/>
-            </w:tcMar>
-            <w:vAlign w:val="center"/>
-            <w:tcBorders>
-              <w:top w:val="single" w:sz="4" w:color="D9E2F3"/>
-              <w:left w:val="single" w:sz="4" w:color="D9E2F3"/>
-              <w:bottom w:val="single" w:sz="4" w:color="D9E2F3"/>
-              <w:right w:val="single" w:sz="4" w:color="D9E2F3"/>
-            </w:tcBorders>
-          </w:tcPr>
-          <w:p>
-            <w:pPr>
-              <w:jc w:val="center"/>
-            </w:pPr>
-            <w:r>
-              <w:rPr>
-                <w:rFonts w:ascii="Times New Roman" w:hAnsi="Times New Roman" w:eastAsia="Times New Roman"/>
-                <w:sz w:val="20"/>
-              </w:rPr>
-              <w:t>3</w:t>
-            </w:r>
-          </w:p>
-        </w:tc>
-        <w:tc>
-          <w:tcPr>
-            <w:tcW w:type="dxa" w:w="2493"/>
-            <w:tcMar>
-              <w:top w:w="110" w:type="dxa"/>
-              <w:start w:w="110" w:type="dxa"/>
-              <w:bottom w:w="110" w:type="dxa"/>
-              <w:end w:w="110" w:type="dxa"/>
-            </w:tcMar>
-            <w:vAlign w:val="center"/>
-            <w:tcBorders>
-              <w:top w:val="single" w:sz="4" w:color="D9E2F3"/>
-              <w:left w:val="single" w:sz="4" w:color="D9E2F3"/>
-              <w:bottom w:val="single" w:sz="4" w:color="D9E2F3"/>
-              <w:right w:val="single" w:sz="4" w:color="D9E2F3"/>
-            </w:tcBorders>
-          </w:tcPr>
-          <w:p>
-            <w:r>
-              <w:rPr>
-                <w:rFonts w:ascii="Times New Roman" w:hAnsi="Times New Roman" w:eastAsia="Times New Roman"/>
-                <w:sz w:val="20"/>
-              </w:rPr>
-              <w:t>YouTube</w:t>
-            </w:r>
-          </w:p>
-        </w:tc>
-        <w:tc>
-          <w:tcPr>
-            <w:tcW w:type="dxa" w:w="2493"/>
-            <w:tcMar>
-              <w:top w:w="110" w:type="dxa"/>
-              <w:start w:w="110" w:type="dxa"/>
-              <w:bottom w:w="110" w:type="dxa"/>
-              <w:end w:w="110" w:type="dxa"/>
-            </w:tcMar>
-            <w:vAlign w:val="center"/>
-            <w:tcBorders>
-              <w:top w:val="single" w:sz="4" w:color="D9E2F3"/>
-              <w:left w:val="single" w:sz="4" w:color="D9E2F3"/>
-              <w:bottom w:val="single" w:sz="4" w:color="D9E2F3"/>
-              <w:right w:val="single" w:sz="4" w:color="D9E2F3"/>
-            </w:tcBorders>
-          </w:tcPr>
-          <w:p>
-            <w:r>
-              <w:rPr>
-                <w:rFonts w:ascii="Times New Roman" w:hAnsi="Times New Roman" w:eastAsia="Times New Roman"/>
-                <w:sz w:val="20"/>
-              </w:rPr>
-              <w:t>URL: ______________________________</w:t>
-              <w:br/>
-              <w:t>Tên kênh: __________________________</w:t>
-            </w:r>
-          </w:p>
-        </w:tc>
-        <w:tc>
-          <w:tcPr>
-            <w:tcW w:type="dxa" w:w="2493"/>
-            <w:tcMar>
-              <w:top w:w="110" w:type="dxa"/>
-              <w:start w:w="110" w:type="dxa"/>
-              <w:bottom w:w="110" w:type="dxa"/>
-              <w:end w:w="110" w:type="dxa"/>
-            </w:tcMar>
-            <w:vAlign w:val="center"/>
-            <w:tcBorders>
-              <w:top w:val="single" w:sz="4" w:color="D9E2F3"/>
-              <w:left w:val="single" w:sz="4" w:color="D9E2F3"/>
-              <w:bottom w:val="single" w:sz="4" w:color="D9E2F3"/>
-              <w:right w:val="single" w:sz="4" w:color="D9E2F3"/>
-            </w:tcBorders>
-          </w:tcPr>
-          <w:p>
-            <w:pPr>
-              <w:jc w:val="center"/>
-            </w:pPr>
-            <w:r>
-              <w:rPr>
-                <w:rFonts w:ascii="Times New Roman" w:hAnsi="Times New Roman" w:eastAsia="Times New Roman"/>
-                <w:sz w:val="20"/>
-              </w:rPr>
-              <w:t>☐</w:t>
-            </w:r>
-          </w:p>
-        </w:tc>
-      </w:tr>
-      <w:tr>
-        <w:trPr>
-          <w:cantSplit/>
-        </w:trPr>
-        <w:tc>
-          <w:tcPr>
-            <w:tcW w:type="dxa" w:w="2493"/>
-            <w:tcMar>
-              <w:top w:w="110" w:type="dxa"/>
-              <w:start w:w="110" w:type="dxa"/>
-              <w:bottom w:w="110" w:type="dxa"/>
-              <w:end w:w="110" w:type="dxa"/>
-            </w:tcMar>
-            <w:vAlign w:val="center"/>
-            <w:tcBorders>
-              <w:top w:val="single" w:sz="4" w:color="D9E2F3"/>
-              <w:left w:val="single" w:sz="4" w:color="D9E2F3"/>
-              <w:bottom w:val="single" w:sz="4" w:color="D9E2F3"/>
-              <w:right w:val="single" w:sz="4" w:color="D9E2F3"/>
-            </w:tcBorders>
-          </w:tcPr>
-          <w:p>
-            <w:pPr>
-              <w:jc w:val="center"/>
-            </w:pPr>
-            <w:r>
-              <w:rPr>
-                <w:rFonts w:ascii="Times New Roman" w:hAnsi="Times New Roman" w:eastAsia="Times New Roman"/>
-                <w:sz w:val="20"/>
-              </w:rPr>
-              <w:t>4</w:t>
-            </w:r>
-          </w:p>
-        </w:tc>
-        <w:tc>
-          <w:tcPr>
-            <w:tcW w:type="dxa" w:w="2493"/>
-            <w:tcMar>
-              <w:top w:w="110" w:type="dxa"/>
-              <w:start w:w="110" w:type="dxa"/>
-              <w:bottom w:w="110" w:type="dxa"/>
-              <w:end w:w="110" w:type="dxa"/>
-            </w:tcMar>
-            <w:vAlign w:val="center"/>
-            <w:tcBorders>
-              <w:top w:val="single" w:sz="4" w:color="D9E2F3"/>
-              <w:left w:val="single" w:sz="4" w:color="D9E2F3"/>
-              <w:bottom w:val="single" w:sz="4" w:color="D9E2F3"/>
-              <w:right w:val="single" w:sz="4" w:color="D9E2F3"/>
-            </w:tcBorders>
-          </w:tcPr>
-          <w:p>
-            <w:r>
-              <w:rPr>
-                <w:rFonts w:ascii="Times New Roman" w:hAnsi="Times New Roman" w:eastAsia="Times New Roman"/>
-                <w:sz w:val="20"/>
-              </w:rPr>
-              <w:t>CCCD/Thẻ căn cước - mặt trước</w:t>
-            </w:r>
-          </w:p>
-        </w:tc>
-        <w:tc>
-          <w:tcPr>
-            <w:tcW w:type="dxa" w:w="2493"/>
-            <w:tcMar>
-              <w:top w:w="110" w:type="dxa"/>
-              <w:start w:w="110" w:type="dxa"/>
-              <w:bottom w:w="110" w:type="dxa"/>
-              <w:end w:w="110" w:type="dxa"/>
-            </w:tcMar>
-            <w:vAlign w:val="center"/>
-            <w:tcBorders>
-              <w:top w:val="single" w:sz="4" w:color="D9E2F3"/>
-              <w:left w:val="single" w:sz="4" w:color="D9E2F3"/>
-              <w:bottom w:val="single" w:sz="4" w:color="D9E2F3"/>
-              <w:right w:val="single" w:sz="4" w:color="D9E2F3"/>
-            </w:tcBorders>
-          </w:tcPr>
-          <w:p>
-            <w:r>
-              <w:rPr>
-                <w:rFonts w:ascii="Times New Roman" w:hAnsi="Times New Roman" w:eastAsia="Times New Roman"/>
-                <w:sz w:val="20"/>
-              </w:rPr>
-              <w:t>Đính kèm ảnh rõ nét</w:t>
-            </w:r>
-          </w:p>
-        </w:tc>
-        <w:tc>
-          <w:tcPr>
-            <w:tcW w:type="dxa" w:w="2493"/>
-            <w:tcMar>
-              <w:top w:w="110" w:type="dxa"/>
-              <w:start w:w="110" w:type="dxa"/>
-              <w:bottom w:w="110" w:type="dxa"/>
-              <w:end w:w="110" w:type="dxa"/>
-            </w:tcMar>
-            <w:vAlign w:val="center"/>
-            <w:tcBorders>
-              <w:top w:val="single" w:sz="4" w:color="D9E2F3"/>
-              <w:left w:val="single" w:sz="4" w:color="D9E2F3"/>
-              <w:bottom w:val="single" w:sz="4" w:color="D9E2F3"/>
-              <w:right w:val="single" w:sz="4" w:color="D9E2F3"/>
-            </w:tcBorders>
-          </w:tcPr>
-          <w:p>
-            <w:pPr>
-              <w:jc w:val="center"/>
-            </w:pPr>
-            <w:r>
-              <w:rPr>
-                <w:rFonts w:ascii="Times New Roman" w:hAnsi="Times New Roman" w:eastAsia="Times New Roman"/>
-                <w:sz w:val="20"/>
-              </w:rPr>
-              <w:t>☐</w:t>
-            </w:r>
-          </w:p>
-        </w:tc>
-      </w:tr>
-      <w:tr>
-        <w:trPr>
-          <w:cantSplit/>
-        </w:trPr>
-        <w:tc>
-          <w:tcPr>
-            <w:tcW w:type="dxa" w:w="2493"/>
-            <w:tcMar>
-              <w:top w:w="110" w:type="dxa"/>
-              <w:start w:w="110" w:type="dxa"/>
-              <w:bottom w:w="110" w:type="dxa"/>
-              <w:end w:w="110" w:type="dxa"/>
-            </w:tcMar>
-            <w:vAlign w:val="center"/>
-            <w:tcBorders>
-              <w:top w:val="single" w:sz="4" w:color="D9E2F3"/>
-              <w:left w:val="single" w:sz="4" w:color="D9E2F3"/>
-              <w:bottom w:val="single" w:sz="4" w:color="D9E2F3"/>
-              <w:right w:val="single" w:sz="4" w:color="D9E2F3"/>
-            </w:tcBorders>
-          </w:tcPr>
-          <w:p>
-            <w:pPr>
-              <w:jc w:val="center"/>
-            </w:pPr>
-            <w:r>
-              <w:rPr>
-                <w:rFonts w:ascii="Times New Roman" w:hAnsi="Times New Roman" w:eastAsia="Times New Roman"/>
-                <w:sz w:val="20"/>
-              </w:rPr>
-              <w:t>5</w:t>
-            </w:r>
-          </w:p>
-        </w:tc>
-        <w:tc>
-          <w:tcPr>
-            <w:tcW w:type="dxa" w:w="2493"/>
-            <w:tcMar>
-              <w:top w:w="110" w:type="dxa"/>
-              <w:start w:w="110" w:type="dxa"/>
-              <w:bottom w:w="110" w:type="dxa"/>
-              <w:end w:w="110" w:type="dxa"/>
-            </w:tcMar>
-            <w:vAlign w:val="center"/>
-            <w:tcBorders>
-              <w:top w:val="single" w:sz="4" w:color="D9E2F3"/>
-              <w:left w:val="single" w:sz="4" w:color="D9E2F3"/>
-              <w:bottom w:val="single" w:sz="4" w:color="D9E2F3"/>
-              <w:right w:val="single" w:sz="4" w:color="D9E2F3"/>
-            </w:tcBorders>
-          </w:tcPr>
-          <w:p>
-            <w:r>
-              <w:rPr>
-                <w:rFonts w:ascii="Times New Roman" w:hAnsi="Times New Roman" w:eastAsia="Times New Roman"/>
-                <w:sz w:val="20"/>
-              </w:rPr>
-              <w:t>CCCD/Thẻ căn cước - mặt sau</w:t>
-            </w:r>
-          </w:p>
-        </w:tc>
-        <w:tc>
-          <w:tcPr>
-            <w:tcW w:type="dxa" w:w="2493"/>
-            <w:tcMar>
-              <w:top w:w="110" w:type="dxa"/>
-              <w:start w:w="110" w:type="dxa"/>
-              <w:bottom w:w="110" w:type="dxa"/>
-              <w:end w:w="110" w:type="dxa"/>
-            </w:tcMar>
-            <w:vAlign w:val="center"/>
-            <w:tcBorders>
-              <w:top w:val="single" w:sz="4" w:color="D9E2F3"/>
-              <w:left w:val="single" w:sz="4" w:color="D9E2F3"/>
-              <w:bottom w:val="single" w:sz="4" w:color="D9E2F3"/>
-              <w:right w:val="single" w:sz="4" w:color="D9E2F3"/>
-            </w:tcBorders>
-          </w:tcPr>
-          <w:p>
-            <w:r>
-              <w:rPr>
-                <w:rFonts w:ascii="Times New Roman" w:hAnsi="Times New Roman" w:eastAsia="Times New Roman"/>
-                <w:sz w:val="20"/>
-              </w:rPr>
-              <w:t>Đính kèm ảnh rõ nét</w:t>
-            </w:r>
-          </w:p>
-        </w:tc>
-        <w:tc>
-          <w:tcPr>
-            <w:tcW w:type="dxa" w:w="2493"/>
-            <w:tcMar>
-              <w:top w:w="110" w:type="dxa"/>
-              <w:start w:w="110" w:type="dxa"/>
-              <w:bottom w:w="110" w:type="dxa"/>
-              <w:end w:w="110" w:type="dxa"/>
-            </w:tcMar>
-            <w:vAlign w:val="center"/>
-            <w:tcBorders>
-              <w:top w:val="single" w:sz="4" w:color="D9E2F3"/>
-              <w:left w:val="single" w:sz="4" w:color="D9E2F3"/>
-              <w:bottom w:val="single" w:sz="4" w:color="D9E2F3"/>
-              <w:right w:val="single" w:sz="4" w:color="D9E2F3"/>
-            </w:tcBorders>
-          </w:tcPr>
-          <w:p>
-            <w:pPr>
-              <w:jc w:val="center"/>
-            </w:pPr>
-            <w:r>
-              <w:rPr>
-                <w:rFonts w:ascii="Times New Roman" w:hAnsi="Times New Roman" w:eastAsia="Times New Roman"/>
-                <w:sz w:val="20"/>
-              </w:rPr>
-              <w:t>☐</w:t>
-            </w:r>
-          </w:p>
-        </w:tc>
-      </w:tr>
-      <w:tr>
-        <w:trPr>
-          <w:cantSplit/>
-        </w:trPr>
-        <w:tc>
-          <w:tcPr>
-            <w:tcW w:type="dxa" w:w="2493"/>
-            <w:tcMar>
-              <w:top w:w="110" w:type="dxa"/>
-              <w:start w:w="110" w:type="dxa"/>
-              <w:bottom w:w="110" w:type="dxa"/>
-              <w:end w:w="110" w:type="dxa"/>
-            </w:tcMar>
-            <w:vAlign w:val="center"/>
-            <w:tcBorders>
-              <w:top w:val="single" w:sz="4" w:color="D9E2F3"/>
-              <w:left w:val="single" w:sz="4" w:color="D9E2F3"/>
-              <w:bottom w:val="single" w:sz="4" w:color="D9E2F3"/>
-              <w:right w:val="single" w:sz="4" w:color="D9E2F3"/>
-            </w:tcBorders>
-          </w:tcPr>
-          <w:p>
-            <w:pPr>
-              <w:jc w:val="center"/>
-            </w:pPr>
-            <w:r>
-              <w:rPr>
-                <w:rFonts w:ascii="Times New Roman" w:hAnsi="Times New Roman" w:eastAsia="Times New Roman"/>
-                <w:sz w:val="20"/>
-              </w:rPr>
-              <w:t>6</w:t>
-            </w:r>
-          </w:p>
-        </w:tc>
-        <w:tc>
-          <w:tcPr>
-            <w:tcW w:type="dxa" w:w="2493"/>
-            <w:tcMar>
-              <w:top w:w="110" w:type="dxa"/>
-              <w:start w:w="110" w:type="dxa"/>
-              <w:bottom w:w="110" w:type="dxa"/>
-              <w:end w:w="110" w:type="dxa"/>
-            </w:tcMar>
-            <w:vAlign w:val="center"/>
-            <w:tcBorders>
-              <w:top w:val="single" w:sz="4" w:color="D9E2F3"/>
-              <w:left w:val="single" w:sz="4" w:color="D9E2F3"/>
-              <w:bottom w:val="single" w:sz="4" w:color="D9E2F3"/>
-              <w:right w:val="single" w:sz="4" w:color="D9E2F3"/>
-            </w:tcBorders>
-          </w:tcPr>
-          <w:p>
-            <w:r>
-              <w:rPr>
-                <w:rFonts w:ascii="Times New Roman" w:hAnsi="Times New Roman" w:eastAsia="Times New Roman"/>
-                <w:sz w:val="20"/>
-              </w:rPr>
-              <w:t>Video khuôn mặt xác minh</w:t>
-            </w:r>
-          </w:p>
-        </w:tc>
-        <w:tc>
-          <w:tcPr>
-            <w:tcW w:type="dxa" w:w="2493"/>
-            <w:tcMar>
-              <w:top w:w="110" w:type="dxa"/>
-              <w:start w:w="110" w:type="dxa"/>
-              <w:bottom w:w="110" w:type="dxa"/>
-              <w:end w:w="110" w:type="dxa"/>
-            </w:tcMar>
-            <w:vAlign w:val="center"/>
-            <w:tcBorders>
-              <w:top w:val="single" w:sz="4" w:color="D9E2F3"/>
-              <w:left w:val="single" w:sz="4" w:color="D9E2F3"/>
-              <w:bottom w:val="single" w:sz="4" w:color="D9E2F3"/>
-              <w:right w:val="single" w:sz="4" w:color="D9E2F3"/>
-            </w:tcBorders>
-          </w:tcPr>
-          <w:p>
-            <w:r>
-              <w:rPr>
-                <w:rFonts w:ascii="Times New Roman" w:hAnsi="Times New Roman" w:eastAsia="Times New Roman"/>
-                <w:sz w:val="20"/>
-              </w:rPr>
-              <w:t>File/video 5–15 giây; khuôn mặt rõ; không filter che mặt</w:t>
-            </w:r>
-          </w:p>
-        </w:tc>
-        <w:tc>
-          <w:tcPr>
-            <w:tcW w:type="dxa" w:w="2493"/>
-            <w:tcMar>
-              <w:top w:w="110" w:type="dxa"/>
-              <w:start w:w="110" w:type="dxa"/>
-              <w:bottom w:w="110" w:type="dxa"/>
-              <w:end w:w="110" w:type="dxa"/>
-            </w:tcMar>
-            <w:vAlign w:val="center"/>
-            <w:tcBorders>
-              <w:top w:val="single" w:sz="4" w:color="D9E2F3"/>
-              <w:left w:val="single" w:sz="4" w:color="D9E2F3"/>
-              <w:bottom w:val="single" w:sz="4" w:color="D9E2F3"/>
-              <w:right w:val="single" w:sz="4" w:color="D9E2F3"/>
-            </w:tcBorders>
-          </w:tcPr>
-          <w:p>
-            <w:pPr>
-              <w:jc w:val="center"/>
-            </w:pPr>
-            <w:r>
-              <w:rPr>
-                <w:rFonts w:ascii="Times New Roman" w:hAnsi="Times New Roman" w:eastAsia="Times New Roman"/>
-                <w:sz w:val="20"/>
-              </w:rPr>
-              <w:t>☐</w:t>
-            </w:r>
-          </w:p>
-        </w:tc>
-      </w:tr>
-      <w:tr>
-        <w:trPr>
-          <w:cantSplit/>
-        </w:trPr>
-        <w:tc>
-          <w:tcPr>
-            <w:tcW w:type="dxa" w:w="2493"/>
-            <w:tcMar>
-              <w:top w:w="110" w:type="dxa"/>
-              <w:start w:w="110" w:type="dxa"/>
-              <w:bottom w:w="110" w:type="dxa"/>
-              <w:end w:w="110" w:type="dxa"/>
-            </w:tcMar>
-            <w:vAlign w:val="center"/>
-            <w:tcBorders>
-              <w:top w:val="single" w:sz="4" w:color="D9E2F3"/>
-              <w:left w:val="single" w:sz="4" w:color="D9E2F3"/>
-              <w:bottom w:val="single" w:sz="4" w:color="D9E2F3"/>
-              <w:right w:val="single" w:sz="4" w:color="D9E2F3"/>
-            </w:tcBorders>
-          </w:tcPr>
-          <w:p>
-            <w:pPr>
-              <w:jc w:val="center"/>
-            </w:pPr>
-            <w:r>
-              <w:rPr>
-                <w:rFonts w:ascii="Times New Roman" w:hAnsi="Times New Roman" w:eastAsia="Times New Roman"/>
-                <w:sz w:val="20"/>
-              </w:rPr>
-              <w:t>7</w:t>
-            </w:r>
-          </w:p>
-        </w:tc>
-        <w:tc>
-          <w:tcPr>
-            <w:tcW w:type="dxa" w:w="2493"/>
-            <w:tcMar>
-              <w:top w:w="110" w:type="dxa"/>
-              <w:start w:w="110" w:type="dxa"/>
-              <w:bottom w:w="110" w:type="dxa"/>
-              <w:end w:w="110" w:type="dxa"/>
-            </w:tcMar>
-            <w:vAlign w:val="center"/>
-            <w:tcBorders>
-              <w:top w:val="single" w:sz="4" w:color="D9E2F3"/>
-              <w:left w:val="single" w:sz="4" w:color="D9E2F3"/>
-              <w:bottom w:val="single" w:sz="4" w:color="D9E2F3"/>
-              <w:right w:val="single" w:sz="4" w:color="D9E2F3"/>
-            </w:tcBorders>
-          </w:tcPr>
-          <w:p>
-            <w:r>
-              <w:rPr>
-                <w:rFonts w:ascii="Times New Roman" w:hAnsi="Times New Roman" w:eastAsia="Times New Roman"/>
-                <w:sz w:val="20"/>
-              </w:rPr>
-              <w:t>Mã số thuế cá nhân</w:t>
-            </w:r>
-          </w:p>
-        </w:tc>
-        <w:tc>
-          <w:tcPr>
-            <w:tcW w:type="dxa" w:w="2493"/>
-            <w:tcMar>
-              <w:top w:w="110" w:type="dxa"/>
-              <w:start w:w="110" w:type="dxa"/>
-              <w:bottom w:w="110" w:type="dxa"/>
-              <w:end w:w="110" w:type="dxa"/>
-            </w:tcMar>
-            <w:vAlign w:val="center"/>
-            <w:tcBorders>
-              <w:top w:val="single" w:sz="4" w:color="D9E2F3"/>
-              <w:left w:val="single" w:sz="4" w:color="D9E2F3"/>
-              <w:bottom w:val="single" w:sz="4" w:color="D9E2F3"/>
-              <w:right w:val="single" w:sz="4" w:color="D9E2F3"/>
-            </w:tcBorders>
-          </w:tcPr>
-          <w:p>
-            <w:r>
-              <w:rPr>
-                <w:rFonts w:ascii="Times New Roman" w:hAnsi="Times New Roman" w:eastAsia="Times New Roman"/>
-                <w:sz w:val="20"/>
-              </w:rPr>
-              <w:t>____________________________________</w:t>
-            </w:r>
-          </w:p>
-        </w:tc>
-        <w:tc>
-          <w:tcPr>
-            <w:tcW w:type="dxa" w:w="2493"/>
-            <w:tcMar>
-              <w:top w:w="110" w:type="dxa"/>
-              <w:start w:w="110" w:type="dxa"/>
-              <w:bottom w:w="110" w:type="dxa"/>
-              <w:end w:w="110" w:type="dxa"/>
-            </w:tcMar>
-            <w:vAlign w:val="center"/>
-            <w:tcBorders>
-              <w:top w:val="single" w:sz="4" w:color="D9E2F3"/>
-              <w:left w:val="single" w:sz="4" w:color="D9E2F3"/>
-              <w:bottom w:val="single" w:sz="4" w:color="D9E2F3"/>
-              <w:right w:val="single" w:sz="4" w:color="D9E2F3"/>
-            </w:tcBorders>
-          </w:tcPr>
-          <w:p>
-            <w:pPr>
-              <w:jc w:val="center"/>
-            </w:pPr>
-            <w:r>
-              <w:rPr>
-                <w:rFonts w:ascii="Times New Roman" w:hAnsi="Times New Roman" w:eastAsia="Times New Roman"/>
-                <w:sz w:val="20"/>
-              </w:rPr>
-              <w:t>☐</w:t>
-            </w:r>
-          </w:p>
-        </w:tc>
-      </w:tr>
-      <w:tr>
-        <w:trPr>
-          <w:cantSplit/>
-        </w:trPr>
-        <w:tc>
-          <w:tcPr>
-            <w:tcW w:type="dxa" w:w="2493"/>
-            <w:tcMar>
-              <w:top w:w="110" w:type="dxa"/>
-              <w:start w:w="110" w:type="dxa"/>
-              <w:bottom w:w="110" w:type="dxa"/>
-              <w:end w:w="110" w:type="dxa"/>
-            </w:tcMar>
-            <w:vAlign w:val="center"/>
-            <w:tcBorders>
-              <w:top w:val="single" w:sz="4" w:color="D9E2F3"/>
-              <w:left w:val="single" w:sz="4" w:color="D9E2F3"/>
-              <w:bottom w:val="single" w:sz="4" w:color="D9E2F3"/>
-              <w:right w:val="single" w:sz="4" w:color="D9E2F3"/>
-            </w:tcBorders>
-          </w:tcPr>
-          <w:p>
-            <w:pPr>
-              <w:jc w:val="center"/>
-            </w:pPr>
-            <w:r>
-              <w:rPr>
-                <w:rFonts w:ascii="Times New Roman" w:hAnsi="Times New Roman" w:eastAsia="Times New Roman"/>
-                <w:sz w:val="20"/>
-              </w:rPr>
-              <w:t>8</w:t>
-            </w:r>
-          </w:p>
-        </w:tc>
-        <w:tc>
-          <w:tcPr>
-            <w:tcW w:type="dxa" w:w="2493"/>
-            <w:tcMar>
-              <w:top w:w="110" w:type="dxa"/>
-              <w:start w:w="110" w:type="dxa"/>
-              <w:bottom w:w="110" w:type="dxa"/>
-              <w:end w:w="110" w:type="dxa"/>
-            </w:tcMar>
-            <w:vAlign w:val="center"/>
-            <w:tcBorders>
-              <w:top w:val="single" w:sz="4" w:color="D9E2F3"/>
-              <w:left w:val="single" w:sz="4" w:color="D9E2F3"/>
-              <w:bottom w:val="single" w:sz="4" w:color="D9E2F3"/>
-              <w:right w:val="single" w:sz="4" w:color="D9E2F3"/>
-            </w:tcBorders>
-          </w:tcPr>
-          <w:p>
-            <w:r>
-              <w:rPr>
-                <w:rFonts w:ascii="Times New Roman" w:hAnsi="Times New Roman" w:eastAsia="Times New Roman"/>
-                <w:sz w:val="20"/>
-              </w:rPr>
-              <w:t>Tài khoản ngân hàng</w:t>
-            </w:r>
-          </w:p>
-        </w:tc>
-        <w:tc>
-          <w:tcPr>
-            <w:tcW w:type="dxa" w:w="2493"/>
-            <w:tcMar>
-              <w:top w:w="110" w:type="dxa"/>
-              <w:start w:w="110" w:type="dxa"/>
-              <w:bottom w:w="110" w:type="dxa"/>
-              <w:end w:w="110" w:type="dxa"/>
-            </w:tcMar>
-            <w:vAlign w:val="center"/>
-            <w:tcBorders>
-              <w:top w:val="single" w:sz="4" w:color="D9E2F3"/>
-              <w:left w:val="single" w:sz="4" w:color="D9E2F3"/>
-              <w:bottom w:val="single" w:sz="4" w:color="D9E2F3"/>
-              <w:right w:val="single" w:sz="4" w:color="D9E2F3"/>
-            </w:tcBorders>
-          </w:tcPr>
-          <w:p>
-            <w:r>
-              <w:rPr>
-                <w:rFonts w:ascii="Times New Roman" w:hAnsi="Times New Roman" w:eastAsia="Times New Roman"/>
-                <w:sz w:val="20"/>
-              </w:rPr>
-              <w:t>STK: _______________________________</w:t>
-              <w:br/>
-              <w:t>Ngân hàng: _________________________</w:t>
-            </w:r>
-          </w:p>
-        </w:tc>
-        <w:tc>
-          <w:tcPr>
-            <w:tcW w:type="dxa" w:w="2493"/>
-            <w:tcMar>
-              <w:top w:w="110" w:type="dxa"/>
-              <w:start w:w="110" w:type="dxa"/>
-              <w:bottom w:w="110" w:type="dxa"/>
-              <w:end w:w="110" w:type="dxa"/>
-            </w:tcMar>
-            <w:vAlign w:val="center"/>
-            <w:tcBorders>
-              <w:top w:val="single" w:sz="4" w:color="D9E2F3"/>
-              <w:left w:val="single" w:sz="4" w:color="D9E2F3"/>
-              <w:bottom w:val="single" w:sz="4" w:color="D9E2F3"/>
-              <w:right w:val="single" w:sz="4" w:color="D9E2F3"/>
-            </w:tcBorders>
-          </w:tcPr>
-          <w:p>
-            <w:pPr>
-              <w:jc w:val="center"/>
-            </w:pPr>
-            <w:r>
-              <w:rPr>
-                <w:rFonts w:ascii="Times New Roman" w:hAnsi="Times New Roman" w:eastAsia="Times New Roman"/>
-                <w:sz w:val="20"/>
-              </w:rPr>
-              <w:t>☐</w:t>
-            </w:r>
-          </w:p>
-        </w:tc>
-      </w:tr>
-      <w:tr>
-        <w:trPr>
-          <w:cantSplit/>
-        </w:trPr>
-        <w:tc>
-          <w:tcPr>
-            <w:tcW w:type="dxa" w:w="2493"/>
-            <w:tcMar>
-              <w:top w:w="110" w:type="dxa"/>
-              <w:start w:w="110" w:type="dxa"/>
-              <w:bottom w:w="110" w:type="dxa"/>
-              <w:end w:w="110" w:type="dxa"/>
-            </w:tcMar>
-            <w:vAlign w:val="center"/>
-            <w:tcBorders>
-              <w:top w:val="single" w:sz="4" w:color="D9E2F3"/>
-              <w:left w:val="single" w:sz="4" w:color="D9E2F3"/>
-              <w:bottom w:val="single" w:sz="4" w:color="D9E2F3"/>
-              <w:right w:val="single" w:sz="4" w:color="D9E2F3"/>
-            </w:tcBorders>
-          </w:tcPr>
-          <w:p>
-            <w:pPr>
-              <w:jc w:val="center"/>
-            </w:pPr>
-            <w:r>
-              <w:rPr>
-                <w:rFonts w:ascii="Times New Roman" w:hAnsi="Times New Roman" w:eastAsia="Times New Roman"/>
-                <w:sz w:val="20"/>
-              </w:rPr>
-              <w:t>9</w:t>
-            </w:r>
-          </w:p>
-        </w:tc>
-        <w:tc>
-          <w:tcPr>
-            <w:tcW w:type="dxa" w:w="2493"/>
-            <w:tcMar>
-              <w:top w:w="110" w:type="dxa"/>
-              <w:start w:w="110" w:type="dxa"/>
-              <w:bottom w:w="110" w:type="dxa"/>
-              <w:end w:w="110" w:type="dxa"/>
-            </w:tcMar>
-            <w:vAlign w:val="center"/>
-            <w:tcBorders>
-              <w:top w:val="single" w:sz="4" w:color="D9E2F3"/>
-              <w:left w:val="single" w:sz="4" w:color="D9E2F3"/>
-              <w:bottom w:val="single" w:sz="4" w:color="D9E2F3"/>
-              <w:right w:val="single" w:sz="4" w:color="D9E2F3"/>
-            </w:tcBorders>
-          </w:tcPr>
-          <w:p>
-            <w:r>
-              <w:rPr>
-                <w:rFonts w:ascii="Times New Roman" w:hAnsi="Times New Roman" w:eastAsia="Times New Roman"/>
-                <w:sz w:val="20"/>
-              </w:rPr>
-              <w:t>Email / SĐT</w:t>
-            </w:r>
-          </w:p>
-        </w:tc>
-        <w:tc>
-          <w:tcPr>
-            <w:tcW w:type="dxa" w:w="2493"/>
-            <w:tcMar>
-              <w:top w:w="110" w:type="dxa"/>
-              <w:start w:w="110" w:type="dxa"/>
-              <w:bottom w:w="110" w:type="dxa"/>
-              <w:end w:w="110" w:type="dxa"/>
-            </w:tcMar>
-            <w:vAlign w:val="center"/>
-            <w:tcBorders>
-              <w:top w:val="single" w:sz="4" w:color="D9E2F3"/>
-              <w:left w:val="single" w:sz="4" w:color="D9E2F3"/>
-              <w:bottom w:val="single" w:sz="4" w:color="D9E2F3"/>
-              <w:right w:val="single" w:sz="4" w:color="D9E2F3"/>
-            </w:tcBorders>
-          </w:tcPr>
-          <w:p>
-            <w:r>
-              <w:rPr>
-                <w:rFonts w:ascii="Times New Roman" w:hAnsi="Times New Roman" w:eastAsia="Times New Roman"/>
-                <w:sz w:val="20"/>
-              </w:rPr>
-              <w:t>____________________________________</w:t>
-            </w:r>
-          </w:p>
-        </w:tc>
-        <w:tc>
-          <w:tcPr>
-            <w:tcW w:type="dxa" w:w="2493"/>
-            <w:tcMar>
-              <w:top w:w="110" w:type="dxa"/>
-              <w:start w:w="110" w:type="dxa"/>
-              <w:bottom w:w="110" w:type="dxa"/>
-              <w:end w:w="110" w:type="dxa"/>
-            </w:tcMar>
-            <w:vAlign w:val="center"/>
-            <w:tcBorders>
-              <w:top w:val="single" w:sz="4" w:color="D9E2F3"/>
-              <w:left w:val="single" w:sz="4" w:color="D9E2F3"/>
-              <w:bottom w:val="single" w:sz="4" w:color="D9E2F3"/>
-              <w:right w:val="single" w:sz="4" w:color="D9E2F3"/>
-            </w:tcBorders>
-          </w:tcPr>
-          <w:p>
-            <w:pPr>
-              <w:jc w:val="center"/>
-            </w:pPr>
-            <w:r>
-              <w:rPr>
-                <w:rFonts w:ascii="Times New Roman" w:hAnsi="Times New Roman" w:eastAsia="Times New Roman"/>
-                <w:sz w:val="20"/>
-              </w:rPr>
-              <w:t>☐</w:t>
-            </w:r>
-          </w:p>
-        </w:tc>
-      </w:tr>
-      <w:tr>
-        <w:trPr>
-          <w:cantSplit/>
-        </w:trPr>
-        <w:tc>
-          <w:tcPr>
-            <w:tcW w:type="dxa" w:w="2493"/>
-            <w:tcMar>
-              <w:top w:w="110" w:type="dxa"/>
-              <w:start w:w="110" w:type="dxa"/>
-              <w:bottom w:w="110" w:type="dxa"/>
-              <w:end w:w="110" w:type="dxa"/>
-            </w:tcMar>
-            <w:vAlign w:val="center"/>
-            <w:tcBorders>
-              <w:top w:val="single" w:sz="4" w:color="D9E2F3"/>
-              <w:left w:val="single" w:sz="4" w:color="D9E2F3"/>
-              <w:bottom w:val="single" w:sz="4" w:color="D9E2F3"/>
-              <w:right w:val="single" w:sz="4" w:color="D9E2F3"/>
-            </w:tcBorders>
-          </w:tcPr>
-          <w:p>
-            <w:pPr>
-              <w:jc w:val="center"/>
-            </w:pPr>
-            <w:r>
-              <w:rPr>
-                <w:rFonts w:ascii="Times New Roman" w:hAnsi="Times New Roman" w:eastAsia="Times New Roman"/>
-                <w:sz w:val="20"/>
-              </w:rPr>
-              <w:t>10</w:t>
-            </w:r>
-          </w:p>
-        </w:tc>
-        <w:tc>
-          <w:tcPr>
-            <w:tcW w:type="dxa" w:w="2493"/>
-            <w:tcMar>
-              <w:top w:w="110" w:type="dxa"/>
-              <w:start w:w="110" w:type="dxa"/>
-              <w:bottom w:w="110" w:type="dxa"/>
-              <w:end w:w="110" w:type="dxa"/>
-            </w:tcMar>
-            <w:vAlign w:val="center"/>
-            <w:tcBorders>
-              <w:top w:val="single" w:sz="4" w:color="D9E2F3"/>
-              <w:left w:val="single" w:sz="4" w:color="D9E2F3"/>
-              <w:bottom w:val="single" w:sz="4" w:color="D9E2F3"/>
-              <w:right w:val="single" w:sz="4" w:color="D9E2F3"/>
-            </w:tcBorders>
-          </w:tcPr>
-          <w:p>
-            <w:r>
-              <w:rPr>
-                <w:rFonts w:ascii="Times New Roman" w:hAnsi="Times New Roman" w:eastAsia="Times New Roman"/>
-                <w:sz w:val="20"/>
-              </w:rPr>
-              <w:t>Nền tảng khác (nếu có)</w:t>
-            </w:r>
-          </w:p>
-        </w:tc>
-        <w:tc>
-          <w:tcPr>
-            <w:tcW w:type="dxa" w:w="2493"/>
-            <w:tcMar>
-              <w:top w:w="110" w:type="dxa"/>
-              <w:start w:w="110" w:type="dxa"/>
-              <w:bottom w:w="110" w:type="dxa"/>
-              <w:end w:w="110" w:type="dxa"/>
-            </w:tcMar>
-            <w:vAlign w:val="center"/>
-            <w:tcBorders>
-              <w:top w:val="single" w:sz="4" w:color="D9E2F3"/>
-              <w:left w:val="single" w:sz="4" w:color="D9E2F3"/>
-              <w:bottom w:val="single" w:sz="4" w:color="D9E2F3"/>
-              <w:right w:val="single" w:sz="4" w:color="D9E2F3"/>
-            </w:tcBorders>
-          </w:tcPr>
-          <w:p>
-            <w:r>
-              <w:rPr>
-                <w:rFonts w:ascii="Times New Roman" w:hAnsi="Times New Roman" w:eastAsia="Times New Roman"/>
-                <w:sz w:val="20"/>
-              </w:rPr>
-              <w:t>Instagram/Threads/Website/Khác: __________________</w:t>
-            </w:r>
-          </w:p>
-        </w:tc>
-        <w:tc>
-          <w:tcPr>
-            <w:tcW w:type="dxa" w:w="2493"/>
-            <w:tcMar>
-              <w:top w:w="110" w:type="dxa"/>
-              <w:start w:w="110" w:type="dxa"/>
-              <w:bottom w:w="110" w:type="dxa"/>
-              <w:end w:w="110" w:type="dxa"/>
-            </w:tcMar>
-            <w:vAlign w:val="center"/>
-            <w:tcBorders>
-              <w:top w:val="single" w:sz="4" w:color="D9E2F3"/>
-              <w:left w:val="single" w:sz="4" w:color="D9E2F3"/>
-              <w:bottom w:val="single" w:sz="4" w:color="D9E2F3"/>
-              <w:right w:val="single" w:sz="4" w:color="D9E2F3"/>
-            </w:tcBorders>
-          </w:tcPr>
-          <w:p>
-            <w:pPr>
-              <w:jc w:val="center"/>
-            </w:pPr>
-            <w:r>
-              <w:rPr>
-                <w:rFonts w:ascii="Times New Roman" w:hAnsi="Times New Roman" w:eastAsia="Times New Roman"/>
-                <w:sz w:val="20"/>
-              </w:rPr>
-              <w:t>☐</w:t>
-            </w:r>
-          </w:p>
-        </w:tc>
-      </w:tr>
-    </w:tbl>
-    <w:p>
-      <w:pPr>
-        <w:spacing w:before="200"/>
-      </w:pPr>
-      <w:r>
-        <w:rPr>
-          <w:rFonts w:ascii="Times New Roman" w:hAnsi="Times New Roman" w:eastAsia="Times New Roman"/>
-          <w:b/>
-          <w:color w:val="203248"/>
-          <w:sz w:val="23"/>
-        </w:rPr>
-        <w:t>XÁC NHẬN CỦA BÊN B VỀ DỮ LIỆU XÁC MINH</w:t>
-      </w:r>
-    </w:p>
-    <w:p>
-      <w:pPr>
-        <w:spacing w:after="60"/>
-      </w:pPr>
-      <w:r>
-        <w:rPr>
-          <w:rFonts w:ascii="Times New Roman" w:hAnsi="Times New Roman" w:eastAsia="Times New Roman"/>
-          <w:sz w:val="22"/>
-        </w:rPr>
-        <w:t>☐ Tôi xác nhận các thông tin, link tài khoản, giấy tờ và video cung cấp là của tôi/hợp pháp và chính xác tại thời điểm đăng ký.</w:t>
-      </w:r>
-    </w:p>
-    <w:p>
-      <w:pPr>
-        <w:spacing w:after="60"/>
-      </w:pPr>
-      <w:r>
-        <w:rPr>
-          <w:rFonts w:ascii="Times New Roman" w:hAnsi="Times New Roman" w:eastAsia="Times New Roman"/>
-          <w:sz w:val="22"/>
-        </w:rPr>
-        <w:t>☐ Tôi đồng ý để Bên A xử lý các dữ liệu trên cho mục đích xác minh danh tính, chống gian lận, quản lý hợp tác, đối soát, thanh toán, thuế, hỗ trợ và tuân thủ pháp luật theo Điều 10 của Thỏa thuận.</w:t>
-      </w:r>
-    </w:p>
-    <w:p>
-      <w:pPr>
-        <w:spacing w:after="60"/>
-      </w:pPr>
-      <w:r>
-        <w:rPr>
-          <w:rFonts w:ascii="Times New Roman" w:hAnsi="Times New Roman" w:eastAsia="Times New Roman"/>
-          <w:sz w:val="22"/>
-        </w:rPr>
-        <w:t>☐ Tôi hiểu rằng ảnh CCCD/Thẻ căn cước và video khuôn mặt không được Bên A dùng cho quảng cáo, đăng công khai hoặc huấn luyện AI nếu chưa có sự đồng ý riêng của tôi.</w:t>
-      </w:r>
-    </w:p>
-    <w:p>
-      <w:pPr>
-        <w:pageBreakBefore/>
-        <w:jc w:val="center"/>
-      </w:pPr>
-      <w:r>
-        <w:rPr>
-          <w:rFonts w:ascii="Times New Roman" w:hAnsi="Times New Roman" w:eastAsia="Times New Roman"/>
-          <w:b/>
-          <w:color w:val="1A365D"/>
-          <w:sz w:val="30"/>
-        </w:rPr>
-        <w:t>PHỤ LỤC 02</w:t>
-      </w:r>
-    </w:p>
-    <w:p>
-      <w:pPr>
-        <w:jc w:val="center"/>
-      </w:pPr>
-      <w:r>
-        <w:rPr>
-          <w:rFonts w:ascii="Times New Roman" w:hAnsi="Times New Roman" w:eastAsia="Times New Roman"/>
-          <w:b/>
-          <w:sz w:val="26"/>
-        </w:rPr>
-        <w:t>THÔNG TIN CHIẾN DỊCH / HOA HỒNG</w:t>
-      </w:r>
-    </w:p>
-    <w:tbl>
-      <w:tblPr>
-        <w:tblW w:type="auto" w:w="0"/>
-        <w:jc w:val="center"/>
-        <w:tblLook w:firstColumn="1" w:firstRow="1" w:lastColumn="0" w:lastRow="0" w:noHBand="0" w:noVBand="1" w:val="04A0"/>
-      </w:tblPr>
-      <w:tblGrid>
-        <w:gridCol w:w="4986"/>
-        <w:gridCol w:w="4986"/>
-      </w:tblGrid>
-      <w:tr>
-        <w:trPr>
-          <w:cantSplit/>
-        </w:trPr>
-        <w:tc>
-          <w:tcPr>
-            <w:tcW w:type="dxa" w:w="4986"/>
-            <w:tcMar>
-              <w:top w:w="120" w:type="dxa"/>
-              <w:start w:w="130" w:type="dxa"/>
-              <w:bottom w:w="120" w:type="dxa"/>
-              <w:end w:w="130" w:type="dxa"/>
-            </w:tcMar>
-            <w:tcBorders>
-              <w:top w:val="single" w:sz="4" w:color="D9E2F3"/>
-              <w:left w:val="single" w:sz="4" w:color="D9E2F3"/>
-              <w:bottom w:val="single" w:sz="4" w:color="D9E2F3"/>
-              <w:right w:val="single" w:sz="4" w:color="D9E2F3"/>
-            </w:tcBorders>
-            <w:shd w:fill="EDF2F7"/>
-          </w:tcPr>
-          <w:p>
-            <w:r>
-              <w:rPr>
-                <w:rFonts w:ascii="Times New Roman" w:hAnsi="Times New Roman" w:eastAsia="Times New Roman"/>
-                <w:b/>
-                <w:sz w:val="21"/>
-              </w:rPr>
-              <w:t>Tên chiến dịch</w:t>
-            </w:r>
-          </w:p>
-        </w:tc>
-        <w:tc>
-          <w:tcPr>
-            <w:tcW w:type="dxa" w:w="4986"/>
-            <w:tcMar>
-              <w:top w:w="120" w:type="dxa"/>
-              <w:start w:w="130" w:type="dxa"/>
-              <w:bottom w:w="120" w:type="dxa"/>
-              <w:end w:w="130" w:type="dxa"/>
-            </w:tcMar>
-            <w:tcBorders>
-              <w:top w:val="single" w:sz="4" w:color="D9E2F3"/>
-              <w:left w:val="single" w:sz="4" w:color="D9E2F3"/>
-              <w:bottom w:val="single" w:sz="4" w:color="D9E2F3"/>
-              <w:right w:val="single" w:sz="4" w:color="D9E2F3"/>
-            </w:tcBorders>
-          </w:tcPr>
-          <w:p>
-            <w:r>
-              <w:rPr>
-                <w:rFonts w:ascii="Times New Roman" w:hAnsi="Times New Roman" w:eastAsia="Times New Roman"/>
-                <w:sz w:val="21"/>
-              </w:rPr>
-              <w:t>[……………………]</w:t>
-            </w:r>
-          </w:p>
-        </w:tc>
-      </w:tr>
-      <w:tr>
-        <w:trPr>
-          <w:cantSplit/>
-        </w:trPr>
-        <w:tc>
-          <w:tcPr>
-            <w:tcW w:type="dxa" w:w="4986"/>
-            <w:tcMar>
-              <w:top w:w="120" w:type="dxa"/>
-              <w:start w:w="130" w:type="dxa"/>
-              <w:bottom w:w="120" w:type="dxa"/>
-              <w:end w:w="130" w:type="dxa"/>
-            </w:tcMar>
-            <w:tcBorders>
-              <w:top w:val="single" w:sz="4" w:color="D9E2F3"/>
-              <w:left w:val="single" w:sz="4" w:color="D9E2F3"/>
-              <w:bottom w:val="single" w:sz="4" w:color="D9E2F3"/>
-              <w:right w:val="single" w:sz="4" w:color="D9E2F3"/>
-            </w:tcBorders>
-            <w:shd w:fill="EDF2F7"/>
-          </w:tcPr>
-          <w:p>
-            <w:r>
-              <w:rPr>
-                <w:rFonts w:ascii="Times New Roman" w:hAnsi="Times New Roman" w:eastAsia="Times New Roman"/>
-                <w:b/>
-                <w:sz w:val="21"/>
-              </w:rPr>
-              <w:t>Sàn/đối tác</w:t>
-            </w:r>
-          </w:p>
-        </w:tc>
-        <w:tc>
-          <w:tcPr>
-            <w:tcW w:type="dxa" w:w="4986"/>
-            <w:tcMar>
-              <w:top w:w="120" w:type="dxa"/>
-              <w:start w:w="130" w:type="dxa"/>
-              <w:bottom w:w="120" w:type="dxa"/>
-              <w:end w:w="130" w:type="dxa"/>
-            </w:tcMar>
-            <w:tcBorders>
-              <w:top w:val="single" w:sz="4" w:color="D9E2F3"/>
-              <w:left w:val="single" w:sz="4" w:color="D9E2F3"/>
-              <w:bottom w:val="single" w:sz="4" w:color="D9E2F3"/>
-              <w:right w:val="single" w:sz="4" w:color="D9E2F3"/>
-            </w:tcBorders>
-          </w:tcPr>
-          <w:p>
-            <w:r>
-              <w:rPr>
-                <w:rFonts w:ascii="Times New Roman" w:hAnsi="Times New Roman" w:eastAsia="Times New Roman"/>
-                <w:sz w:val="21"/>
-              </w:rPr>
-              <w:t>[Shopee/TikTok Shop/Lazada/Khác]</w:t>
-            </w:r>
-          </w:p>
-        </w:tc>
-      </w:tr>
-      <w:tr>
-        <w:trPr>
-          <w:cantSplit/>
-        </w:trPr>
-        <w:tc>
-          <w:tcPr>
-            <w:tcW w:type="dxa" w:w="4986"/>
-            <w:tcMar>
-              <w:top w:w="120" w:type="dxa"/>
-              <w:start w:w="130" w:type="dxa"/>
-              <w:bottom w:w="120" w:type="dxa"/>
-              <w:end w:w="130" w:type="dxa"/>
-            </w:tcMar>
-            <w:tcBorders>
-              <w:top w:val="single" w:sz="4" w:color="D9E2F3"/>
-              <w:left w:val="single" w:sz="4" w:color="D9E2F3"/>
-              <w:bottom w:val="single" w:sz="4" w:color="D9E2F3"/>
-              <w:right w:val="single" w:sz="4" w:color="D9E2F3"/>
-            </w:tcBorders>
-            <w:shd w:fill="EDF2F7"/>
-          </w:tcPr>
-          <w:p>
-            <w:r>
-              <w:rPr>
-                <w:rFonts w:ascii="Times New Roman" w:hAnsi="Times New Roman" w:eastAsia="Times New Roman"/>
-                <w:b/>
-                <w:sz w:val="21"/>
-              </w:rPr>
-              <w:t>Thời gian</w:t>
-            </w:r>
-          </w:p>
-        </w:tc>
-        <w:tc>
-          <w:tcPr>
-            <w:tcW w:type="dxa" w:w="4986"/>
-            <w:tcMar>
-              <w:top w:w="120" w:type="dxa"/>
-              <w:start w:w="130" w:type="dxa"/>
-              <w:bottom w:w="120" w:type="dxa"/>
-              <w:end w:w="130" w:type="dxa"/>
-            </w:tcMar>
-            <w:tcBorders>
-              <w:top w:val="single" w:sz="4" w:color="D9E2F3"/>
-              <w:left w:val="single" w:sz="4" w:color="D9E2F3"/>
-              <w:bottom w:val="single" w:sz="4" w:color="D9E2F3"/>
-              <w:right w:val="single" w:sz="4" w:color="D9E2F3"/>
-            </w:tcBorders>
-          </w:tcPr>
-          <w:p>
-            <w:r>
-              <w:rPr>
-                <w:rFonts w:ascii="Times New Roman" w:hAnsi="Times New Roman" w:eastAsia="Times New Roman"/>
-                <w:sz w:val="21"/>
-              </w:rPr>
-              <w:t>Từ ……/……/…… đến ……/……/……</w:t>
-            </w:r>
-          </w:p>
-        </w:tc>
-      </w:tr>
-      <w:tr>
-        <w:trPr>
-          <w:cantSplit/>
-        </w:trPr>
-        <w:tc>
-          <w:tcPr>
-            <w:tcW w:type="dxa" w:w="4986"/>
-            <w:tcMar>
-              <w:top w:w="120" w:type="dxa"/>
-              <w:start w:w="130" w:type="dxa"/>
-              <w:bottom w:w="120" w:type="dxa"/>
-              <w:end w:w="130" w:type="dxa"/>
-            </w:tcMar>
-            <w:tcBorders>
-              <w:top w:val="single" w:sz="4" w:color="D9E2F3"/>
-              <w:left w:val="single" w:sz="4" w:color="D9E2F3"/>
-              <w:bottom w:val="single" w:sz="4" w:color="D9E2F3"/>
-              <w:right w:val="single" w:sz="4" w:color="D9E2F3"/>
-            </w:tcBorders>
-            <w:shd w:fill="EDF2F7"/>
-          </w:tcPr>
-          <w:p>
-            <w:r>
-              <w:rPr>
-                <w:rFonts w:ascii="Times New Roman" w:hAnsi="Times New Roman" w:eastAsia="Times New Roman"/>
-                <w:b/>
-                <w:sz w:val="21"/>
-              </w:rPr>
-              <w:t>Kênh đăng</w:t>
-            </w:r>
-          </w:p>
-        </w:tc>
-        <w:tc>
-          <w:tcPr>
-            <w:tcW w:type="dxa" w:w="4986"/>
-            <w:tcMar>
-              <w:top w:w="120" w:type="dxa"/>
-              <w:start w:w="130" w:type="dxa"/>
-              <w:bottom w:w="120" w:type="dxa"/>
-              <w:end w:w="130" w:type="dxa"/>
-            </w:tcMar>
-            <w:tcBorders>
-              <w:top w:val="single" w:sz="4" w:color="D9E2F3"/>
-              <w:left w:val="single" w:sz="4" w:color="D9E2F3"/>
-              <w:bottom w:val="single" w:sz="4" w:color="D9E2F3"/>
-              <w:right w:val="single" w:sz="4" w:color="D9E2F3"/>
-            </w:tcBorders>
-          </w:tcPr>
-          <w:p>
-            <w:r>
-              <w:rPr>
-                <w:rFonts w:ascii="Times New Roman" w:hAnsi="Times New Roman" w:eastAsia="Times New Roman"/>
-                <w:sz w:val="21"/>
-              </w:rPr>
-              <w:t>[TikTok/Facebook/YouTube/Khác]</w:t>
-            </w:r>
-          </w:p>
-        </w:tc>
-      </w:tr>
-      <w:tr>
-        <w:trPr>
-          <w:cantSplit/>
-        </w:trPr>
-        <w:tc>
-          <w:tcPr>
-            <w:tcW w:type="dxa" w:w="4986"/>
-            <w:tcMar>
-              <w:top w:w="120" w:type="dxa"/>
-              <w:start w:w="130" w:type="dxa"/>
-              <w:bottom w:w="120" w:type="dxa"/>
-              <w:end w:w="130" w:type="dxa"/>
-            </w:tcMar>
-            <w:tcBorders>
-              <w:top w:val="single" w:sz="4" w:color="D9E2F3"/>
-              <w:left w:val="single" w:sz="4" w:color="D9E2F3"/>
-              <w:bottom w:val="single" w:sz="4" w:color="D9E2F3"/>
-              <w:right w:val="single" w:sz="4" w:color="D9E2F3"/>
-            </w:tcBorders>
-            <w:shd w:fill="EDF2F7"/>
-          </w:tcPr>
-          <w:p>
-            <w:r>
-              <w:rPr>
-                <w:rFonts w:ascii="Times New Roman" w:hAnsi="Times New Roman" w:eastAsia="Times New Roman"/>
-                <w:b/>
-                <w:sz w:val="21"/>
-              </w:rPr>
-              <w:t>Số lượng nội dung</w:t>
-            </w:r>
-          </w:p>
-        </w:tc>
-        <w:tc>
-          <w:tcPr>
-            <w:tcW w:type="dxa" w:w="4986"/>
-            <w:tcMar>
-              <w:top w:w="120" w:type="dxa"/>
-              <w:start w:w="130" w:type="dxa"/>
-              <w:bottom w:w="120" w:type="dxa"/>
-              <w:end w:w="130" w:type="dxa"/>
-            </w:tcMar>
-            <w:tcBorders>
-              <w:top w:val="single" w:sz="4" w:color="D9E2F3"/>
-              <w:left w:val="single" w:sz="4" w:color="D9E2F3"/>
-              <w:bottom w:val="single" w:sz="4" w:color="D9E2F3"/>
-              <w:right w:val="single" w:sz="4" w:color="D9E2F3"/>
-            </w:tcBorders>
-          </w:tcPr>
-          <w:p>
-            <w:r>
-              <w:rPr>
-                <w:rFonts w:ascii="Times New Roman" w:hAnsi="Times New Roman" w:eastAsia="Times New Roman"/>
-                <w:sz w:val="21"/>
-              </w:rPr>
-              <w:t>[……………………]</w:t>
-            </w:r>
-          </w:p>
-        </w:tc>
-      </w:tr>
-      <w:tr>
-        <w:trPr>
-          <w:cantSplit/>
-        </w:trPr>
-        <w:tc>
-          <w:tcPr>
-            <w:tcW w:type="dxa" w:w="4986"/>
-            <w:tcMar>
-              <w:top w:w="120" w:type="dxa"/>
-              <w:start w:w="130" w:type="dxa"/>
-              <w:bottom w:w="120" w:type="dxa"/>
-              <w:end w:w="130" w:type="dxa"/>
-            </w:tcMar>
-            <w:tcBorders>
-              <w:top w:val="single" w:sz="4" w:color="D9E2F3"/>
-              <w:left w:val="single" w:sz="4" w:color="D9E2F3"/>
-              <w:bottom w:val="single" w:sz="4" w:color="D9E2F3"/>
-              <w:right w:val="single" w:sz="4" w:color="D9E2F3"/>
-            </w:tcBorders>
-            <w:shd w:fill="EDF2F7"/>
-          </w:tcPr>
-          <w:p>
-            <w:r>
-              <w:t>Mức hoa hồng/tỷ lệ chia sẻ</w:t>
-            </w:r>
-          </w:p>
-        </w:tc>
-        <w:tc>
-          <w:tcPr>
-            <w:tcW w:type="dxa" w:w="4986"/>
-            <w:tcMar>
-              <w:top w:w="120" w:type="dxa"/>
-              <w:start w:w="130" w:type="dxa"/>
-              <w:bottom w:w="120" w:type="dxa"/>
-              <w:end w:w="130" w:type="dxa"/>
-            </w:tcMar>
-            <w:tcBorders>
-              <w:top w:val="single" w:sz="4" w:color="D9E2F3"/>
-              <w:left w:val="single" w:sz="4" w:color="D9E2F3"/>
-              <w:bottom w:val="single" w:sz="4" w:color="D9E2F3"/>
-              <w:right w:val="single" w:sz="4" w:color="D9E2F3"/>
-            </w:tcBorders>
-          </w:tcPr>
-          <w:p>
-            <w:r>
-              <w:t>[……% / ………… VNĐ; cơ sở tính và khấu trừ thuế theo Điều 7]</w:t>
-            </w:r>
-          </w:p>
-        </w:tc>
-      </w:tr>
-      <w:tr>
-        <w:trPr>
-          <w:cantSplit/>
-        </w:trPr>
-        <w:tc>
-          <w:tcPr>
-            <w:tcW w:type="dxa" w:w="4986"/>
-            <w:tcMar>
-              <w:top w:w="120" w:type="dxa"/>
-              <w:start w:w="130" w:type="dxa"/>
-              <w:bottom w:w="120" w:type="dxa"/>
-              <w:end w:w="130" w:type="dxa"/>
-            </w:tcMar>
-            <w:tcBorders>
-              <w:top w:val="single" w:sz="4" w:color="D9E2F3"/>
-              <w:left w:val="single" w:sz="4" w:color="D9E2F3"/>
-              <w:bottom w:val="single" w:sz="4" w:color="D9E2F3"/>
-              <w:right w:val="single" w:sz="4" w:color="D9E2F3"/>
-            </w:tcBorders>
-            <w:shd w:fill="EDF2F7"/>
-          </w:tcPr>
-          <w:p>
-            <w:r>
-              <w:rPr>
-                <w:rFonts w:ascii="Times New Roman" w:hAnsi="Times New Roman" w:eastAsia="Times New Roman"/>
-                <w:b/>
-                <w:sz w:val="21"/>
-              </w:rPr>
-              <w:t>Điều kiện ghi nhận</w:t>
-            </w:r>
-          </w:p>
-        </w:tc>
-        <w:tc>
-          <w:tcPr>
-            <w:tcW w:type="dxa" w:w="4986"/>
-            <w:tcMar>
-              <w:top w:w="120" w:type="dxa"/>
-              <w:start w:w="130" w:type="dxa"/>
-              <w:bottom w:w="120" w:type="dxa"/>
-              <w:end w:w="130" w:type="dxa"/>
-            </w:tcMar>
-            <w:tcBorders>
-              <w:top w:val="single" w:sz="4" w:color="D9E2F3"/>
-              <w:left w:val="single" w:sz="4" w:color="D9E2F3"/>
-              <w:bottom w:val="single" w:sz="4" w:color="D9E2F3"/>
-              <w:right w:val="single" w:sz="4" w:color="D9E2F3"/>
-            </w:tcBorders>
-          </w:tcPr>
-          <w:p>
-            <w:r>
-              <w:rPr>
-                <w:rFonts w:ascii="Times New Roman" w:hAnsi="Times New Roman" w:eastAsia="Times New Roman"/>
-                <w:sz w:val="21"/>
-              </w:rPr>
-              <w:t>[Theo dashboard/chính sách chiến dịch]</w:t>
-            </w:r>
-          </w:p>
-        </w:tc>
-      </w:tr>
-      <w:tr>
-        <w:trPr>
-          <w:cantSplit/>
-        </w:trPr>
-        <w:tc>
-          <w:tcPr>
-            <w:tcW w:type="dxa" w:w="4986"/>
-            <w:tcMar>
-              <w:top w:w="120" w:type="dxa"/>
-              <w:start w:w="130" w:type="dxa"/>
-              <w:bottom w:w="120" w:type="dxa"/>
-              <w:end w:w="130" w:type="dxa"/>
-            </w:tcMar>
-            <w:tcBorders>
-              <w:top w:val="single" w:sz="4" w:color="D9E2F3"/>
-              <w:left w:val="single" w:sz="4" w:color="D9E2F3"/>
-              <w:bottom w:val="single" w:sz="4" w:color="D9E2F3"/>
-              <w:right w:val="single" w:sz="4" w:color="D9E2F3"/>
-            </w:tcBorders>
-            <w:shd w:fill="EDF2F7"/>
-          </w:tcPr>
-          <w:p>
-            <w:r>
-              <w:rPr>
-                <w:rFonts w:ascii="Times New Roman" w:hAnsi="Times New Roman" w:eastAsia="Times New Roman"/>
-                <w:b/>
-                <w:sz w:val="21"/>
-              </w:rPr>
-              <w:t>Lịch đối soát/thanh toán</w:t>
-            </w:r>
-          </w:p>
-        </w:tc>
-        <w:tc>
-          <w:tcPr>
-            <w:tcW w:type="dxa" w:w="4986"/>
-            <w:tcMar>
-              <w:top w:w="120" w:type="dxa"/>
-              <w:start w:w="130" w:type="dxa"/>
-              <w:bottom w:w="120" w:type="dxa"/>
-              <w:end w:w="130" w:type="dxa"/>
-            </w:tcMar>
-            <w:tcBorders>
-              <w:top w:val="single" w:sz="4" w:color="D9E2F3"/>
-              <w:left w:val="single" w:sz="4" w:color="D9E2F3"/>
-              <w:bottom w:val="single" w:sz="4" w:color="D9E2F3"/>
-              <w:right w:val="single" w:sz="4" w:color="D9E2F3"/>
-            </w:tcBorders>
-          </w:tcPr>
-          <w:p>
-            <w:r>
-              <w:rPr>
-                <w:rFonts w:ascii="Times New Roman" w:hAnsi="Times New Roman" w:eastAsia="Times New Roman"/>
-                <w:sz w:val="21"/>
-              </w:rPr>
-              <w:t>[……………………]</w:t>
-            </w:r>
-          </w:p>
-        </w:tc>
-      </w:tr>
-      <w:tr>
-        <w:trPr>
-          <w:cantSplit/>
-        </w:trPr>
-        <w:tc>
-          <w:tcPr>
-            <w:tcW w:type="dxa" w:w="4986"/>
-            <w:tcMar>
-              <w:top w:w="120" w:type="dxa"/>
-              <w:start w:w="130" w:type="dxa"/>
-              <w:bottom w:w="120" w:type="dxa"/>
-              <w:end w:w="130" w:type="dxa"/>
-            </w:tcMar>
-            <w:tcBorders>
-              <w:top w:val="single" w:sz="4" w:color="D9E2F3"/>
-              <w:left w:val="single" w:sz="4" w:color="D9E2F3"/>
-              <w:bottom w:val="single" w:sz="4" w:color="D9E2F3"/>
-              <w:right w:val="single" w:sz="4" w:color="D9E2F3"/>
-            </w:tcBorders>
-            <w:shd w:fill="EDF2F7"/>
-          </w:tcPr>
-          <w:p>
-            <w:r>
-              <w:rPr>
-                <w:rFonts w:ascii="Times New Roman" w:hAnsi="Times New Roman" w:eastAsia="Times New Roman"/>
-                <w:b/>
-                <w:sz w:val="21"/>
-              </w:rPr>
-              <w:t>Yêu cầu đặc biệt</w:t>
-            </w:r>
-          </w:p>
-        </w:tc>
-        <w:tc>
-          <w:tcPr>
-            <w:tcW w:type="dxa" w:w="4986"/>
-            <w:tcMar>
-              <w:top w:w="120" w:type="dxa"/>
-              <w:start w:w="130" w:type="dxa"/>
-              <w:bottom w:w="120" w:type="dxa"/>
-              <w:end w:w="130" w:type="dxa"/>
-            </w:tcMar>
-            <w:tcBorders>
-              <w:top w:val="single" w:sz="4" w:color="D9E2F3"/>
-              <w:left w:val="single" w:sz="4" w:color="D9E2F3"/>
-              <w:bottom w:val="single" w:sz="4" w:color="D9E2F3"/>
-              <w:right w:val="single" w:sz="4" w:color="D9E2F3"/>
-            </w:tcBorders>
-          </w:tcPr>
-          <w:p>
-            <w:r>
-              <w:rPr>
-                <w:rFonts w:ascii="Times New Roman" w:hAnsi="Times New Roman" w:eastAsia="Times New Roman"/>
-                <w:sz w:val="21"/>
-              </w:rPr>
-              <w:t>[……………………]</w:t>
-            </w:r>
-          </w:p>
-        </w:tc>
-      </w:tr>
-    </w:tbl>
-    <w:p>
-      <w:pPr>
-        <w:pageBreakBefore/>
-        <w:jc w:val="center"/>
-      </w:pPr>
-      <w:r>
-        <w:rPr>
-          <w:rFonts w:ascii="Times New Roman" w:hAnsi="Times New Roman" w:eastAsia="Times New Roman"/>
-          <w:b/>
-          <w:color w:val="1A365D"/>
-          <w:sz w:val="26"/>
-        </w:rPr>
-        <w:t>XÁC NHẬN VÀ CHỮ KÝ CÁC BÊN</w:t>
-      </w:r>
-    </w:p>
-    <w:tbl>
-      <w:tblPr>
-        <w:tblW w:type="auto" w:w="0"/>
-        <w:jc w:val="center"/>
-        <w:tblLayout w:type="fixed"/>
-        <w:tblLook w:firstColumn="1" w:firstRow="1" w:lastColumn="0" w:lastRow="0" w:noHBand="0" w:noVBand="1" w:val="04A0"/>
-      </w:tblPr>
-      <w:tblGrid>
-        <w:gridCol w:w="4986"/>
-        <w:gridCol w:w="4986"/>
-      </w:tblGrid>
-      <w:tr>
-        <w:trPr>
-          <w:cantSplit/>
-        </w:trPr>
-        <w:tc>
-          <w:tcPr>
-            <w:tcW w:type="dxa" w:w="4762"/>
-            <w:tcMar>
-              <w:top w:w="180" w:type="dxa"/>
-              <w:start w:w="140" w:type="dxa"/>
-              <w:bottom w:w="180" w:type="dxa"/>
-              <w:end w:w="140" w:type="dxa"/>
-            </w:tcMar>
-          </w:tcPr>
-          <w:p>
-            <w:pPr>
-              <w:jc w:val="center"/>
-            </w:pPr>
-            <w:r>
-              <w:rPr>
-                <w:rFonts w:ascii="Times New Roman" w:hAnsi="Times New Roman" w:eastAsia="Times New Roman"/>
-                <w:b/>
-                <w:sz w:val="23"/>
-              </w:rPr>
-              <w:t>ĐẠI DIỆN BÊN A</w:t>
-            </w:r>
-          </w:p>
-          <w:p>
-            <w:pPr>
-              <w:jc w:val="center"/>
-            </w:pPr>
-            <w:r>
-              <w:rPr>
-                <w:rFonts w:ascii="Times New Roman" w:hAnsi="Times New Roman" w:eastAsia="Times New Roman"/>
-                <w:i/>
-                <w:color w:val="646464"/>
-                <w:sz w:val="19"/>
-              </w:rPr>
-              <w:t>(Ký, ghi rõ họ tên; đóng dấu nếu có)</w:t>
-            </w:r>
-          </w:p>
-          <w:p/>
-          <w:p/>
-          <w:p/>
-          <w:p/>
-          <w:p/>
-          <w:p/>
-          <w:p>
-            <w:pPr>
-              <w:jc w:val="center"/>
-            </w:pPr>
-            <w:r>
-              <w:rPr>
-                <w:rFonts w:ascii="Times New Roman" w:hAnsi="Times New Roman" w:eastAsia="Times New Roman"/>
-                <w:sz w:val="21"/>
-              </w:rPr>
-              <w:t>Họ tên: __________________________</w:t>
-            </w:r>
-          </w:p>
-        </w:tc>
-        <w:tc>
-          <w:tcPr>
-            <w:tcW w:type="dxa" w:w="4762"/>
-            <w:tcMar>
-              <w:top w:w="180" w:type="dxa"/>
-              <w:start w:w="140" w:type="dxa"/>
-              <w:bottom w:w="180" w:type="dxa"/>
-              <w:end w:w="140" w:type="dxa"/>
-            </w:tcMar>
-          </w:tcPr>
-          <w:p>
-            <w:pPr>
-              <w:jc w:val="center"/>
-            </w:pPr>
-            <w:r>
-              <w:rPr>
-                <w:rFonts w:ascii="Times New Roman" w:hAnsi="Times New Roman" w:eastAsia="Times New Roman"/>
-                <w:b/>
-                <w:sz w:val="23"/>
-              </w:rPr>
-              <w:t>BÊN B – KOL/KOC</w:t>
-            </w:r>
-          </w:p>
-          <w:p>
-            <w:pPr>
-              <w:jc w:val="center"/>
-            </w:pPr>
-            <w:r>
-              <w:rPr>
-                <w:rFonts w:ascii="Times New Roman" w:hAnsi="Times New Roman" w:eastAsia="Times New Roman"/>
-                <w:i/>
-                <w:color w:val="646464"/>
-                <w:sz w:val="19"/>
-              </w:rPr>
-            </w:r>
-            <w:r>
-              <w:rPr>
-                <w:rFonts w:ascii="Times New Roman" w:hAnsi="Times New Roman"/>
-                <w:i/>
-                <w:color w:val="646464"/>
-                <w:sz w:val="19"/>
-              </w:rPr>
-              <w:t>(Ký, ghi rõ họ tên)</w:t>
-            </w:r>
-          </w:p>
-          <w:p/>
-          <w:p/>
-          <w:p/>
-          <w:p/>
-          <w:p/>
-          <w:p/>
-          <w:p>
-            <w:pPr>
-              <w:jc w:val="center"/>
-            </w:pPr>
-            <w:r>
-              <w:rPr>
-                <w:rFonts w:ascii="Times New Roman" w:hAnsi="Times New Roman" w:eastAsia="Times New Roman"/>
-                <w:sz w:val="21"/>
-              </w:rPr>
-              <w:t>Họ tên: __________________________</w:t>
-            </w:r>
-          </w:p>
-        </w:tc>
-      </w:tr>
-    </w:tbl>
-    <w:p>
-      <w:pPr>
-        <w:spacing w:before="280"/>
-      </w:pPr>
-      <w:r>
-        <w:rPr>
-          <w:rFonts w:ascii="Times New Roman" w:hAnsi="Times New Roman" w:eastAsia="Times New Roman"/>
-          <w:b/>
-          <w:color w:val="646464"/>
-          <w:sz w:val="19"/>
-        </w:rPr>
-        <w:t xml:space="preserve">Lưu ý sử dụng: </w:t>
-      </w:r>
-      <w:r>
-        <w:rPr>
-          <w:rFonts w:ascii="Times New Roman" w:hAnsi="Times New Roman" w:eastAsia="Times New Roman"/>
-          <w:i/>
-          <w:color w:val="646464"/>
-          <w:sz w:val="19"/>
-        </w:rPr>
-        <w:t>Đây là mẫu thỏa thuận khung. Trước khi phát hành chính thức, cần điền đầy đủ thông tin pháp nhân, MST, người đại diện, ngưỡng/lịch thanh toán, kênh hỗ trợ và chính sách chiến dịch; nên được bộ phận pháp chế/luật sư rà soát theo mô hình vận hành thực tế của doanh nghiệp.</w:t>
-      </w:r>
-    </w:p>
     <w:sectPr>
       <w:headerReference w:type="default" r:id="rId9"/>
       <w:footerReference w:type="default" r:id="rId10"/>

</xml_diff>